<commit_message>
Apply Claude image review and extend English volume draft
</commit_message>
<xml_diff>
--- a/research/magyar-zsido-okleveltar-vii-selected-en.docx
+++ b/research/magyar-zsido-okleveltar-vii-selected-en.docx
@@ -12,7 +12,7 @@
     </w:p>
     <w:p>
       <w:r>
-        <w:t>Budapest, 1963. Edited by Fülöp Grünvald and Sándor Scheiber. Translation checked against the three page images on 16 October 2026. Names and historical place spellings are retained. Square brackets mark editorial explanations or uncertainty. A dash reproduces an empty/dash cell; it is not a newly inferred zero. This is a translation of the published transcription, not of the archival manuscripts.</w:t>
+        <w:t>Budapest, 1963. Edited by Fülöp Grünvald and Sándor Scheiber. Translation checked against the three page images on 16 October 2026. Claude Opus supplied an independent image-based review; the corrections below were checked against enlarged scans. Names and historical place spellings are retained. Square brackets mark editorial explanations or uncertainty. A dash reproduces an empty/dash cell; it is not a newly inferred zero. This is a translation of the published transcription, not of the archival manuscripts.</w:t>
       </w:r>
     </w:p>
     <w:p>
@@ -38,7 +38,7 @@
     </w:p>
     <w:p>
       <w:r>
-        <w:t>He has one copper vessel suitable for distilling spirits and trades only in spirits. In the present circumstances he himself does not know what profit he obtains from this. He has already lived for six years in the house of the nobles Stephan and Jona Pap, otherwise called Ber, without possessing land. He pays the landlords 20 Hungarian florins annually. Toward the village’s allotted contribution, [he pays] 2 Rhenish florins and 40 kreuzer.</w:t>
+        <w:t>He has one copper vessel suitable for distilling spirits and trades only in spirits. In the present circumstances he himself does not know what profit he obtains from this. He has already lived for six years in the house of the nobles Stephani and Jonae Pap, otherwise called Ber, without possessing land. He pays the landlords 20 Hungarian florins annually. Toward the village’s allotted contribution, [he pays] Rh. fl. 2·40 [2 Rhenish florins and 40 kreuzer].</w:t>
       </w:r>
     </w:p>
     <w:p>
@@ -150,7 +150,7 @@
     </w:tbl>
     <w:p>
       <w:r>
-        <w:t>He has one copper distilling vessel and trades in the sale of spirits. What this currently brings him is [unclear in the printed wording: “in compertum habet”; the intended sense may be that it is not ascertained]. He lives at the house of Timosi Borodi. On taking up residence there, he pays nothing either to the proprietor or to the village of Butfalva [the village name in the prose differs from the Szerfalva heading].</w:t>
+        <w:t>He has one copper distilling vessel and trades in the sale of spirits. He has ascertained what this currently brings him [the print reads “in compertum habet”; this differs from the explicit statements of ignorance in the neighbouring entries, and a missing negative is possible but not supplied here]. He lives at the house of Timosi Borodi and has taken refuge/lodging there; he pays nothing either to the landowner or to the village of Butfalva [the village name in the prose differs from the Szerfalva heading].</w:t>
       </w:r>
     </w:p>
     <w:p>
@@ -240,7 +240,7 @@
     </w:tbl>
     <w:p>
       <w:r>
-        <w:t>He has two copper vessels and trades in the sale of wine and spirits. He himself does not know what this brings in annually. He lives in the house of the noble Stephan Rednik, without possessing any land. For three years he has paid 10 Hungarian florins annually for the house. For the palatinal quota he pays 4 Rhenish florins annually.</w:t>
+        <w:t>He has two copper vessels and trades in the sale of wine and spirits. He himself does not know what this brings in annually. He lives in the house of the noble Stephani Rednik, without possessing any land. He has lived there for three years [the phrase may also qualify the payment]; for the house he pays 10 Hungarian florins annually. For the palatinal quota he pays 4 Rhenish florins annually.</w:t>
       </w:r>
     </w:p>
     <w:p>
@@ -248,7 +248,7 @@
         <w:pStyle w:val="Heading2"/>
       </w:pPr>
       <w:r>
-        <w:t>In the village of Kalinfalva</w:t>
+        <w:t>In the village of Kulinfalva</w:t>
       </w:r>
     </w:p>
     <w:tbl>
@@ -356,7 +356,7 @@
           </w:tcPr>
           <w:p>
             <w:r>
-              <w:t>Jacobus [“called” — no further name follows]</w:t>
+              <w:t>Jacobus [the Jew named Jacobus]</w:t>
             </w:r>
           </w:p>
         </w:tc>
@@ -396,7 +396,12 @@
     </w:tbl>
     <w:p>
       <w:r>
-        <w:t>Iszak: Engaging in no trade, he leads a very meagre life [the printed Latin is awkward here]. Sometimes he distils spirits to support himself. For two years he has lived in the house of Thomae Barod. Since he lacks the necessities, he pays neither a charge for the house nor a contribution for the village.</w:t>
+        <w:t>Iszak: Engaging in no trade, he drags out his life with great difficulty [the printed “aeque” is apparently a reading or misprint for “aegre”]. Sometimes he distils spirits to support himself. For two years he has lived in the house of Thomae Barod. Since he lacks the necessities, he pays neither a charge for the house nor a contribution for the village.</w:t>
+      </w:r>
+    </w:p>
+    <w:p>
+      <w:r>
+        <w:t>The heading spells the village Kulinfalva; the prose spells it Kalinfalva. Sidó, retained in the entries, may be a descriptive word for Jewish rather than an inherited surname. Latin names in prose are retained in their printed, inflected forms.</w:t>
       </w:r>
     </w:p>
     <w:p>
@@ -1481,7 +1486,7 @@
           </w:tcPr>
           <w:p>
             <w:r>
-              <w:t>Jacob and Löbelle [2]</w:t>
+              <w:t>Jacob and Löbelle 2.</w:t>
             </w:r>
           </w:p>
         </w:tc>
@@ -2023,7 +2028,7 @@
           </w:tcPr>
           <w:p>
             <w:r>
-              <w:t>Poinha</w:t>
+              <w:t>Kretsunfalva</w:t>
             </w:r>
           </w:p>
         </w:tc>
@@ -2125,7 +2130,7 @@
           </w:tcPr>
           <w:p>
             <w:r>
-              <w:t>Rahel and Sara</w:t>
+              <w:t>Rahell and Sara</w:t>
             </w:r>
           </w:p>
         </w:tc>
@@ -3583,7 +3588,7 @@
     </w:tbl>
     <w:p>
       <w:r>
-        <w:t>Reading note: “Gullfalva” is the spelling on this page; identifying it with Gyulafalva requires corroboration. The two separate Löbell entries under Szapplantzán are retained. The total for Rahel and Sara is copied as 6; do not add two male heads automatically. The blank wife cell for Jacob Mayer also remains blank.</w:t>
+        <w:t>Reading note: “Gullfalva” is the spelling on this page; identifying it with Gyulafalva requires corroboration. The two separate Löbell entries under Szapplantzán are retained. The total for Rahell and Sara is copied as 6; do not add two male heads automatically. The printed dash in Jacob Mayer’s wife cell is retained as a dash.</w:t>
       </w:r>
     </w:p>
     <w:p>
@@ -4867,7 +4872,7 @@
           </w:tcPr>
           <w:p>
             <w:r>
-              <w:t>Nyágva</w:t>
+              <w:t>in Nyágva</w:t>
             </w:r>
           </w:p>
         </w:tc>
@@ -4897,7 +4902,7 @@
           </w:tcPr>
           <w:p>
             <w:r>
-              <w:t>2</w:t>
+              <w:t>1</w:t>
             </w:r>
           </w:p>
         </w:tc>
@@ -4907,7 +4912,7 @@
           </w:tcPr>
           <w:p>
             <w:r>
-              <w:t>-</w:t>
+              <w:t>1</w:t>
             </w:r>
           </w:p>
         </w:tc>
@@ -5481,7 +5486,7 @@
           </w:tcPr>
           <w:p>
             <w:r>
-              <w:t>-</w:t>
+              <w:t>1</w:t>
             </w:r>
           </w:p>
         </w:tc>
@@ -6015,7 +6020,7 @@
           </w:tcPr>
           <w:p>
             <w:r>
-              <w:t>Bedö</w:t>
+              <w:t>Bedő</w:t>
             </w:r>
           </w:p>
         </w:tc>
@@ -6329,7 +6334,7 @@
     </w:tbl>
     <w:p>
       <w:r>
-        <w:t>The last two columns are money, not additional people. The “spouses and widows” column is combined; multiple entries there do not establish multiple concurrent wives. The document continues on printed page 748; no complete-county total appears on page 747.</w:t>
+        <w:t>An additional broad column headed “Numerus:” is empty on this page and is not reproduced as a data column here. The last two columns are money, not additional people. The “spouses and widows” column is combined; multiple entries there do not establish multiple concurrent wives. The document continues on printed page 748; no complete-county total appears on page 747.</w:t>
       </w:r>
     </w:p>
     <w:p>
@@ -6337,7 +6342,7 @@
         <w:pStyle w:val="Heading1"/>
       </w:pPr>
       <w:r>
-        <w:t>What these pages establish for the family research</w:t>
+        <w:t>Separate research commentary — not part of the source</w:t>
       </w:r>
     </w:p>
     <w:p>

</xml_diff>